<commit_message>
fix: colonna Pagato cliccabile, rimossa emoji
</commit_message>
<xml_diff>
--- a/Informazioni - NO WEB/Modifiche - News.docx
+++ b/Informazioni - NO WEB/Modifiche - News.docx
@@ -9,15 +9,39 @@
           <w:ilvl w:val="0"/>
           <w:numId w:val="1"/>
         </w:numPr>
-      </w:pPr>
-      <w:r>
-        <w:t xml:space="preserve">Inserire una nuova colonna nella classifica delle statisitche contenente quanto ognuno di noi ha pagato. La logica è la seguente: </w:t>
-      </w:r>
-      <w:r>
-        <w:t>non c'è un costo fisso perchè dipende in quale bowling andiamo e che giorno della settimana è. L'esempio ti martedì 3 vs 3 è il seguente: per la sfida abbiamo fatto 2 partite e una partita costava 4€ l'una quindi in totale sarebbero 8€ a persona ma dato che chi perde pagava all'altra squadra ogni giocatore della squadra perdente ha pagato 16€ mentre il vincitore ha pagato 0€</w:t>
-      </w:r>
-      <w:r>
-        <w:t xml:space="preserve">. </w:t>
+        <w:rPr>
+          <w:color w:val="92D050"/>
+        </w:rPr>
+      </w:pPr>
+      <w:r>
+        <w:rPr>
+          <w:color w:val="92D050"/>
+        </w:rPr>
+        <w:t xml:space="preserve">Inserire una nuova colonna nella classifica delle statisitche contenente quanto ognuno di noi ha pagato. La logica è la seguente: non c'è un costo fisso perchè dipende in quale bowling andiamo e che giorno della settimana è. </w:t>
+      </w:r>
+      <w:r>
+        <w:rPr>
+          <w:color w:val="92D050"/>
+        </w:rPr>
+        <w:t>E</w:t>
+      </w:r>
+      <w:r>
+        <w:rPr>
+          <w:color w:val="92D050"/>
+        </w:rPr>
+        <w:t>sempio</w:t>
+      </w:r>
+      <w:r>
+        <w:rPr>
+          <w:color w:val="92D050"/>
+        </w:rPr>
+        <w:t xml:space="preserve"> </w:t>
+      </w:r>
+      <w:r>
+        <w:rPr>
+          <w:color w:val="92D050"/>
+        </w:rPr>
+        <w:t xml:space="preserve">martedì 3 vs 3 è il seguente: per la sfida abbiamo fatto 2 partite e una partita costava 4€ l'una quindi in totale sarebbero 8€ a persona ma dato che chi perde pagava all'altra squadra ogni giocatore della squadra perdente ha pagato 16€ mentre il vincitore ha pagato 0€. </w:t>
       </w:r>
     </w:p>
     <w:p>
@@ -27,15 +51,22 @@
           <w:ilvl w:val="0"/>
           <w:numId w:val="5"/>
         </w:numPr>
+        <w:rPr>
+          <w:color w:val="92D050"/>
+        </w:rPr>
       </w:pPr>
       <w:r>
         <w:rPr>
           <w:b/>
           <w:bCs/>
+          <w:color w:val="92D050"/>
         </w:rPr>
         <w:t>Costo per game</w:t>
       </w:r>
       <w:r>
+        <w:rPr>
+          <w:color w:val="92D050"/>
+        </w:rPr>
         <w:t> inserito al momento della sfida (es. €4)</w:t>
       </w:r>
     </w:p>
@@ -46,22 +77,23 @@
           <w:ilvl w:val="0"/>
           <w:numId w:val="5"/>
         </w:numPr>
+        <w:rPr>
+          <w:color w:val="92D050"/>
+        </w:rPr>
       </w:pPr>
       <w:r>
         <w:rPr>
           <w:b/>
           <w:bCs/>
+          <w:color w:val="92D050"/>
         </w:rPr>
         <w:t>Game totali</w:t>
       </w:r>
       <w:r>
-        <w:t> × costo = quanto avrebbe pagato ognuno (es. 2 game × €4 = €8</w:t>
-      </w:r>
-      <w:r>
-        <w:t xml:space="preserve"> </w:t>
-      </w:r>
-      <w:r>
-        <w:t>persona)</w:t>
+        <w:rPr>
+          <w:color w:val="92D050"/>
+        </w:rPr>
+        <w:t> × costo = quanto avrebbe pagato ognuno (es. 2 game × €4 = €8 persona)</w:t>
       </w:r>
     </w:p>
     <w:p>
@@ -71,21 +103,29 @@
           <w:ilvl w:val="0"/>
           <w:numId w:val="5"/>
         </w:numPr>
+        <w:rPr>
+          <w:color w:val="92D050"/>
+        </w:rPr>
       </w:pPr>
       <w:r>
         <w:rPr>
           <w:b/>
           <w:bCs/>
+          <w:color w:val="92D050"/>
         </w:rPr>
         <w:t>Chi perde</w:t>
       </w:r>
       <w:r>
+        <w:rPr>
+          <w:color w:val="92D050"/>
+        </w:rPr>
         <w:t> paga il doppio (i suoi €8 + €8 alla squadra vincitrice) = </w:t>
       </w:r>
       <w:r>
         <w:rPr>
           <w:b/>
           <w:bCs/>
+          <w:color w:val="92D050"/>
         </w:rPr>
         <w:t>€16</w:t>
       </w:r>
@@ -97,25 +137,36 @@
           <w:ilvl w:val="0"/>
           <w:numId w:val="5"/>
         </w:numPr>
+        <w:rPr>
+          <w:color w:val="92D050"/>
+        </w:rPr>
       </w:pPr>
       <w:r>
         <w:rPr>
           <w:b/>
           <w:bCs/>
+          <w:color w:val="92D050"/>
         </w:rPr>
         <w:t>Chi vince</w:t>
       </w:r>
       <w:r>
+        <w:rPr>
+          <w:color w:val="92D050"/>
+        </w:rPr>
         <w:t> paga </w:t>
       </w:r>
       <w:r>
         <w:rPr>
           <w:b/>
           <w:bCs/>
+          <w:color w:val="92D050"/>
         </w:rPr>
         <w:t>€0</w:t>
       </w:r>
       <w:r>
+        <w:rPr>
+          <w:color w:val="92D050"/>
+        </w:rPr>
         <w:t> (viene coperto dai perdenti)</w:t>
       </w:r>
     </w:p>
@@ -126,15 +177,22 @@
           <w:ilvl w:val="0"/>
           <w:numId w:val="5"/>
         </w:numPr>
+        <w:rPr>
+          <w:color w:val="92D050"/>
+        </w:rPr>
       </w:pPr>
       <w:r>
         <w:rPr>
           <w:b/>
           <w:bCs/>
+          <w:color w:val="92D050"/>
         </w:rPr>
         <w:t>Singoli</w:t>
       </w:r>
       <w:r>
+        <w:rPr>
+          <w:color w:val="92D050"/>
+        </w:rPr>
         <w:t> pagano solo i loro game (es. 2 game × €4 = €8), non partecipano alla sfida</w:t>
       </w:r>
     </w:p>
@@ -145,8 +203,14 @@
           <w:ilvl w:val="0"/>
           <w:numId w:val="5"/>
         </w:numPr>
-      </w:pPr>
-      <w:r>
+        <w:rPr>
+          <w:color w:val="92D050"/>
+        </w:rPr>
+      </w:pPr>
+      <w:r>
+        <w:rPr>
+          <w:color w:val="92D050"/>
+        </w:rPr>
         <w:t>Confermo: se ci sono 3 perdenti × €8 = €24 totali che vanno ai 3 vincitori = €8 a testa.</w:t>
       </w:r>
     </w:p>
@@ -157,18 +221,28 @@
           <w:ilvl w:val="0"/>
           <w:numId w:val="5"/>
         </w:numPr>
-      </w:pPr>
-      <w:r>
+        <w:rPr>
+          <w:color w:val="92D050"/>
+        </w:rPr>
+      </w:pPr>
+      <w:r>
+        <w:rPr>
+          <w:color w:val="92D050"/>
+        </w:rPr>
         <w:t>E se la sfida è </w:t>
       </w:r>
       <w:r>
         <w:rPr>
           <w:b/>
           <w:bCs/>
+          <w:color w:val="92D050"/>
         </w:rPr>
         <w:t>pareggata</w:t>
       </w:r>
       <w:r>
+        <w:rPr>
+          <w:color w:val="92D050"/>
+        </w:rPr>
         <w:t> — ognuno paga i suoi €8</w:t>
       </w:r>
     </w:p>
@@ -191,8 +265,14 @@
           <w:ilvl w:val="0"/>
           <w:numId w:val="1"/>
         </w:numPr>
-      </w:pPr>
-      <w:r>
+        <w:rPr>
+          <w:color w:val="92D050"/>
+        </w:rPr>
+      </w:pPr>
+      <w:r>
+        <w:rPr>
+          <w:color w:val="92D050"/>
+        </w:rPr>
         <w:t xml:space="preserve">Quando modifico una sessione me ne crea un'altra e non mi modifica idati di quella li </w:t>
       </w:r>
     </w:p>
@@ -738,7 +818,7 @@
       <w:lvlText w:val=""/>
       <w:lvlJc w:val="left"/>
       <w:pPr>
-        <w:ind w:left="720" w:hanging="360"/>
+        <w:ind w:left="1068" w:hanging="360"/>
       </w:pPr>
       <w:rPr>
         <w:rFonts w:ascii="Symbol" w:hAnsi="Symbol" w:hint="default"/>
@@ -750,7 +830,7 @@
       <w:lvlText w:val="o"/>
       <w:lvlJc w:val="left"/>
       <w:pPr>
-        <w:ind w:left="1440" w:hanging="360"/>
+        <w:ind w:left="1788" w:hanging="360"/>
       </w:pPr>
       <w:rPr>
         <w:rFonts w:ascii="Courier New" w:hAnsi="Courier New" w:hint="default"/>
@@ -762,7 +842,7 @@
       <w:lvlText w:val=""/>
       <w:lvlJc w:val="left"/>
       <w:pPr>
-        <w:ind w:left="2160" w:hanging="360"/>
+        <w:ind w:left="2508" w:hanging="360"/>
       </w:pPr>
       <w:rPr>
         <w:rFonts w:ascii="Wingdings" w:hAnsi="Wingdings" w:hint="default"/>
@@ -774,7 +854,7 @@
       <w:lvlText w:val=""/>
       <w:lvlJc w:val="left"/>
       <w:pPr>
-        <w:ind w:left="2880" w:hanging="360"/>
+        <w:ind w:left="3228" w:hanging="360"/>
       </w:pPr>
       <w:rPr>
         <w:rFonts w:ascii="Symbol" w:hAnsi="Symbol" w:hint="default"/>
@@ -786,7 +866,7 @@
       <w:lvlText w:val="o"/>
       <w:lvlJc w:val="left"/>
       <w:pPr>
-        <w:ind w:left="3600" w:hanging="360"/>
+        <w:ind w:left="3948" w:hanging="360"/>
       </w:pPr>
       <w:rPr>
         <w:rFonts w:ascii="Courier New" w:hAnsi="Courier New" w:hint="default"/>
@@ -798,7 +878,7 @@
       <w:lvlText w:val=""/>
       <w:lvlJc w:val="left"/>
       <w:pPr>
-        <w:ind w:left="4320" w:hanging="360"/>
+        <w:ind w:left="4668" w:hanging="360"/>
       </w:pPr>
       <w:rPr>
         <w:rFonts w:ascii="Wingdings" w:hAnsi="Wingdings" w:hint="default"/>
@@ -810,7 +890,7 @@
       <w:lvlText w:val=""/>
       <w:lvlJc w:val="left"/>
       <w:pPr>
-        <w:ind w:left="5040" w:hanging="360"/>
+        <w:ind w:left="5388" w:hanging="360"/>
       </w:pPr>
       <w:rPr>
         <w:rFonts w:ascii="Symbol" w:hAnsi="Symbol" w:hint="default"/>
@@ -822,7 +902,7 @@
       <w:lvlText w:val="o"/>
       <w:lvlJc w:val="left"/>
       <w:pPr>
-        <w:ind w:left="5760" w:hanging="360"/>
+        <w:ind w:left="6108" w:hanging="360"/>
       </w:pPr>
       <w:rPr>
         <w:rFonts w:ascii="Courier New" w:hAnsi="Courier New" w:hint="default"/>
@@ -834,7 +914,7 @@
       <w:lvlText w:val=""/>
       <w:lvlJc w:val="left"/>
       <w:pPr>
-        <w:ind w:left="6480" w:hanging="360"/>
+        <w:ind w:left="6828" w:hanging="360"/>
       </w:pPr>
       <w:rPr>
         <w:rFonts w:ascii="Wingdings" w:hAnsi="Wingdings" w:hint="default"/>

</xml_diff>

<commit_message>
fix: array_reverse pallini forma statistiche, ordine uguale dashboard
</commit_message>
<xml_diff>
--- a/Informazioni - NO WEB/Modifiche - News.docx
+++ b/Informazioni - NO WEB/Modifiche - News.docx
@@ -295,8 +295,14 @@
           <w:ilvl w:val="0"/>
           <w:numId w:val="1"/>
         </w:numPr>
-      </w:pPr>
-      <w:r>
+        <w:rPr>
+          <w:color w:val="92D050"/>
+        </w:rPr>
+      </w:pPr>
+      <w:r>
+        <w:rPr>
+          <w:color w:val="92D050"/>
+        </w:rPr>
         <w:t xml:space="preserve">L’ordine delle V/N/P della classifica nella dashboard e della classifica delle statistiche sono di ordine diverso invece devono essere uguali. L’ordine deve essere uguale a quello delle sessioni. </w:t>
       </w:r>
     </w:p>

</xml_diff>

<commit_message>
feat: suggeritore mostra 2 proposte compatte, selezione con click
</commit_message>
<xml_diff>
--- a/Informazioni - NO WEB/Modifiche - News.docx
+++ b/Informazioni - NO WEB/Modifiche - News.docx
@@ -253,8 +253,14 @@
           <w:ilvl w:val="0"/>
           <w:numId w:val="1"/>
         </w:numPr>
-      </w:pPr>
-      <w:r>
+        <w:rPr>
+          <w:color w:val="92D050"/>
+        </w:rPr>
+      </w:pPr>
+      <w:r>
+        <w:rPr>
+          <w:color w:val="92D050"/>
+        </w:rPr>
         <w:t>Dato che nel tempo vorrò mettere più cose che può fare l’amministratore e/o gli utenti in un futuro creare in alto a destra 3 trattini o un menu con le cose che possono fare gli operstori. Al momento se lo clicca un utente normale metti un pop-up in cui dici che non e’ amministratore, se lo clicca l’amministratore allora escono le opzioni per crere una nuova partita e per salvare il databse (quindi togli i tasti dalle pagine in cui ci sono e mettili solo in quel menu li nuovo)</w:t>
       </w:r>
     </w:p>
@@ -313,8 +319,14 @@
           <w:ilvl w:val="0"/>
           <w:numId w:val="1"/>
         </w:numPr>
-      </w:pPr>
-      <w:r>
+        <w:rPr>
+          <w:color w:val="92D050"/>
+        </w:rPr>
+      </w:pPr>
+      <w:r>
+        <w:rPr>
+          <w:color w:val="92D050"/>
+        </w:rPr>
         <w:t>La modifica/eliminazione delle sessioni NON DEVE POTERLI FARE ANCHE L’UTENTE BASE</w:t>
       </w:r>
     </w:p>

</xml_diff>